<commit_message>
Fix report accuracy and trim generated-looking comments in lab 4
Correct unverified claims in the report (model selection reasoning,
Sonnet 5 benchmarks with proper SWE-bench variant labeling, an
observed umbrella contradiction example), add plain-language
explanations of benchmark numbers, and drop decorative comment
dividers from the Makefile and testgen.py header.
</commit_message>
<xml_diff>
--- a/Sem2/Lab 4 (10)/Задание 1/Игнатьев Д.С ИстМД-11 Отчет Лаб 4(10).docx
+++ b/Sem2/Lab 4 (10)/Задание 1/Игнатьев Д.С ИстМД-11 Отчет Лаб 4(10).docx
@@ -350,7 +350,7 @@
         <w:jc w:val="both"/>
       </w:pPr>
       <w:r>
-        <w:t xml:space="preserve">Выбор модели. Ограничение жёсткое — 6 ГБ видеопамяти ноутбучной RTX 3060. Рассматривал llama3.2:3b (слабовата в русском языке), mistral 7b в 4-битном квантовании (влезает впритык и вытесняется в оперативную память, когда видеопамять нужна кому-то ещё), gemma2:2b (быстрая, но хуже следует формату) и qwen2.5:3b (1.9 ГБ на диске, приличный русский, хорошо слушается системных промптов). Выбрал qwen2.5:3b как компромисс между качеством русского языка, скоростью и запасом видеопамяти.</w:t>
+        <w:t xml:space="preserve">Выбор модели. Ограничение жёсткое — 6 ГБ видеопамяти ноутбучной RTX 3060, и часть этой памяти параллельно делят Docker с n8n. По размеру подходили модели в районе 2–7 миллиардов параметров: llama3.2:3b, gemma2:2b, mistral 7b в 4-битном квантовании, qwen2.5:3b и им подобные. Mistral 7b даже в 4-битном квантовании занимает почти весь доступный объём и не оставляет запаса под контекст и параллельные процессы — с ним рискованно параллельно гонять Docker. Из моделей поменьше остановился на qwen2.5:3b: 1.9 ГБ на диске, у линейки Qwen устойчиво хорошая репутация по русскому языку среди моделей такого размера, и на практике по своим прогонам не увидел ни одной грубой поломки текста на русском.</w:t>
       </w:r>
     </w:p>
     <w:p>
@@ -1230,7 +1230,7 @@
         <w:jc w:val="both"/>
       </w:pPr>
       <w:r>
-        <w:t xml:space="preserve">Третий — и самый интересный — слой проблем: качество генерации. Structured outputs отработали идеально в узком смысле: за все прогоны ни одной ошибки разбора JSON, все обязательные поля на месте, comfort всегда целое в диапазоне. Но схема не гарантирует здравый смысл внутри полей. Модель периодически выдавала «зонт: брать» при нулевой вероятности осадков (и однажды — с обоснованием «вероятность осадков 0%, но зонт всё равно не нужен» внутри поля причины при umbrella=true), а в списке одежды у неё встречались «базовые трусики или носки», «зонт не нужен» как предмет гардероба и несуществующее слово «припартируй» в советах.</w:t>
+        <w:t xml:space="preserve">Третий — и самый интересный — слой проблем: качество генерации. Structured outputs отработали идеально в узком смысле: за все прогоны ни одной ошибки разбора JSON, все обязательные поля на месте, comfort всегда целое в диапазоне. Но схема не гарантирует здравый смысл внутри полей. Модель не держала связь между булевым полем и текстовым обоснованием: например, при нулевой вероятности осадков однажды вернула umbrella=false, но в самом umbrella_reason честно написала «зонт может быть полезен при порывах ветра, рекомендую взять зонтик» — то есть текст противоречил собственному «нет». В другой раз, наоборот, при тех же нулевых осадках поле umbrella пришло true, хотя по правилу, которое ей же было продиктовано в промпте, зонт был не нужен. В списке одежды у неё встречались «базовые трусики или носки», «зонт не нужен» как предмет гардероба и несуществующее слово «припартируй» в советах.</w:t>
       </w:r>
     </w:p>
     <w:p>
@@ -1250,7 +1250,7 @@
         <w:jc w:val="both"/>
       </w:pPr>
       <w:r>
-        <w:t xml:space="preserve">После доработки прогнал контрольную серию по пяти городам с контрастной погодой (таблица 2): решение про зонт совпало с правилом во всех случаях, включая Санкт-Петербург со 100% вероятностью осадков, абсурдных пунктов в одежде не осталось. Остаточные дефекты — редкие падежные рассогласования вида «непромокаемые обувь» и «кроссовок»; на них 3b-модель, честно говоря, право имеет, на смысл советов они не влияют. Интерфейс приложения с реальным ответом показан на рисунке 1.</w:t>
+        <w:t xml:space="preserve">После доработки прогнал контрольную серию по пяти городам с контрастной погодой (таблица 2): решение про зонт совпало с правилом во всех случаях, включая Санкт-Петербург со 100% вероятностью осадков, абсурдных пунктов в одежде не осталось. Остаточный дефект — редкие падежные рассогласования вида «непромокаемые обувь» (прилагательное во множественном числе при существительном в единственном); на них 3b-модель, честно говоря, право имеет, на смысл советов они не влияют. Интерфейс приложения с реальным ответом показан на рисунке 1.</w:t>
       </w:r>
     </w:p>
     <w:p>
@@ -2755,17 +2755,37 @@
         <w:jc w:val="both"/>
       </w:pPr>
       <w:r>
-        <w:t xml:space="preserve">Бесплатный сегмент к 2026 году выглядит многослойно. Универсальные чат-ассистенты (ChatGPT, Claude, Gemini, DeepSeek, Qwen Chat) дают бесплатный доступ к моделям среднего класса с дневными лимитами сообщений; российские GigaChat и YandexGPT тоже бесплатны для личного использования, но в кодинге заметно слабее лидеров. Инструменты в редакторе устроены иначе: у GitHub Copilot бесплатный тариф — 2000 автодополнений и 50 чат-сообщений в месяц, у Codeium автодополнения вообще без лимита, у Windsurf безлимитны базовые подсказки. Отдельно стоит Google Antigravity, который на бесплатном тарифе даёт доступ к модели уровня Claude Opus 4.5 — по независимым тестам она набирает около 81% на бенчмарке SWE-bench, это не «урезанная» модель для галочки. И наконец полностью бесплатные локальные модели через Ollama или LM Studio (qwen, llama, deepseek-r1 в младших размерах) — лимитов нет вообще, но, как показала эта работа, любой их вывод нужно проверять кодом.</w:t>
-      </w:r>
-    </w:p>
-    <w:p>
-      <w:pPr>
-        <w:spacing w:after="60" w:before="60" w:line="360"/>
-        <w:ind w:firstLine="709"/>
-        <w:jc w:val="both"/>
-      </w:pPr>
-      <w:r>
-        <w:t xml:space="preserve">Почему для этой работы годится именно Claude Sonnet 5. У бесплатного аккаунта Claude — около 30 сообщений в сутки при обычной нагрузке и контекст порядка 100 000 токенов; более сильная модель Opus зарезервирована за платной подпиской. Но по независимым сравнениям Sonnet 5 — первая модель среднего уровня, которая на практике дотягивается до флагманской на агентных и кодовых задачах: в части сценариев она даже опережает старший Opus предыдущего поколения. На практике это ощущается так: план на большую работу модель держит сама, код на Python и JavaScript пишет рабочий с первого-второго захода, а с русским текстом отчёта справляется без корявых фраз. Из минусов, которые я реально почувствовал: суточный лимит сообщений подгадывает в самый неподходящий момент (в справке к бесплатному тарифу прямо пишут, что его хватит на пару мелких правок или один быстрый рефакторинг, не больше), а без доступа к Opus самые каверзные задачи — как отладка почему батник ломается из-за кодировки консоли — решаются дольше, методом проб и ошибок, а не с первой подсказки.</w:t>
+        <w:t xml:space="preserve">Бесплатный сегмент к 2026 году выглядит многослойно. Универсальные чат-ассистенты (ChatGPT, Claude, Gemini, DeepSeek, Qwen Chat) дают бесплатный доступ к моделям среднего класса с дневными лимитами сообщений; российские GigaChat и YandexGPT тоже бесплатны для личного использования, но в кодинге заметно слабее лидеров. Инструменты в редакторе устроены иначе: у GitHub Copilot бесплатный тариф — 2000 автодополнений и 50 чат-сообщений в месяц, у Codeium автодополнения вообще без лимита, у Windsurf безлимитны базовые подсказки. Отдельно стоит Google Antigravity, который на бесплатном тарифе даёт доступ к модели уровня Claude Opus 4.5 — по независимым тестам она набирает около 81% на бенчмарке SWE-bench Verified (стандартный вариант теста) — это не «урезанная» модель для галочки. И наконец полностью бесплатные локальные модели через Ollama или LM Studio (qwen, llama, deepseek-r1 в младших размерах) — лимитов нет вообще, но, как показала эта работа, любой их вывод нужно проверять кодом.</w:t>
+      </w:r>
+    </w:p>
+    <w:p>
+      <w:pPr>
+        <w:spacing w:after="60" w:before="60" w:line="360"/>
+        <w:ind w:firstLine="709"/>
+        <w:jc w:val="both"/>
+      </w:pPr>
+      <w:r>
+        <w:t xml:space="preserve">Почему для этой работы годится именно Claude Sonnet 5. Модель вышла 30 июня 2026 года — на момент работы над лабораторной это самая свежая версия Sonnet, заявленная как самая «агентная» в этой линейке. Прежде чем приводить цифры бенчмарков, стоит объяснить, что они вообще измеряют: модели дают реальную, заранее незнакомую ей задачу и смотрят, сколько раз из ста она справляется полностью самостоятельно, без подсказок. Два теста здесь особенно к месту. SWE-bench (Pro и Verified — Pro строже, задачи берутся из живых, активно развивающихся open-source репозиториев без утечки в обучающую выборку) — модели дают настоящий баг-репорт в чужом проекте и просят самостоятельно разобраться в незнакомом коде и всё исправить, как поручили бы тикет джуну. Terminal-Bench 2.1 — это не диалог в чате, а работа прямо в командной строке: запустить команду, прочитать вывод, отреагировать на ошибку, попробовать снова — ровно то, чем я занимался весь этот отчёт, когда разбирался, почему батник ломается из-за кодировки консоли, или пересобирал exe через PyInstaller.</w:t>
+      </w:r>
+    </w:p>
+    <w:p>
+      <w:pPr>
+        <w:spacing w:after="60" w:before="60" w:line="360"/>
+        <w:ind w:firstLine="709"/>
+        <w:jc w:val="both"/>
+      </w:pPr>
+      <w:r>
+        <w:t xml:space="preserve">По независимым бенчмаркам Sonnet 5 уже не выглядит младшей сестрой топового Opus 4.8: на Terminal-Bench 2.1 у Sonnet 5 80.4% против 74.6% у Opus 4.8 — это первый случай, когда модель среднего тира обгоняет собственный топовый Opus на крупном тесте, завязанном на работу с инструментами. На агентном SWE-bench Pro отставание от Opus 4.8 всё же есть — 63.2% против 69.2%, то есть на действительно тяжёлых многошаговых задачах разрыв ощутим (это заведомо более суровый вариант теста, чем обычный SWE-bench Verified из предыдущего абзаца про Opus 4.5 — цифры напрямую сравнивать нельзя, это разные экзамены). Для рядового пользователя такой процент — это не «работает без ошибок», а грубая прикидка: из сотни похожих чужих задач такого типа модель самостоятельно закрывает примерно столько-то. Это не гарантия для конкретно моего проекта, а ориентир, и я больше доверяю не проценту, а собственному результату из раздела 7: модель на практике успешно прошла именно такую терминальную отладку — значит, цифра не только на бумаге. Для объёма этой лабораторной — некрупные модули на Python и JavaScript, конфигурация инструментов, отладка по логам — такой мощности с запасом.</w:t>
+      </w:r>
+    </w:p>
+    <w:p>
+      <w:pPr>
+        <w:spacing w:after="60" w:before="60" w:line="360"/>
+        <w:ind w:firstLine="709"/>
+        <w:jc w:val="both"/>
+      </w:pPr>
+      <w:r>
+        <w:t xml:space="preserve">У бесплатного аккаунта Claude — суточный лимит сообщений (по обзорам бесплатных тарифов разных сервисов — порядка нескольких десятков в день, а не безлимит), доступ к Opus остаётся платным. Итог по Sonnet 5 коротко: закрывает уверенно — держит план на многошаговую работу без напоминаний, пишет рабочий код на Python и JavaScript с первого-второго захода, нормально пишет по-русски и сама разбирается в незнакомых форматах вроде Modelfile Ollama или воркфлоу n8n. Не закрывает сама — упирается в суточный лимит сообщений (несколько раз ловил его посреди отладки и приходилось ждать), без доступа к Opus каверзные задачи вроде того самого бага с кодировкой батника решает дольше, методом проб и ошибок, а не с первой подсказки. И результату всё равно нельзя доверять вслепую — почему именно, разберу отдельно ниже.</w:t>
       </w:r>
     </w:p>
     <w:p>
@@ -2805,7 +2825,7 @@
         <w:jc w:val="both"/>
       </w:pPr>
       <w:r>
-        <w:t xml:space="preserve">Итоговая оценка: для учебных, типовых и прототипных задач такого масштаба бесплатного сегмента сегодня достаточно с запасом — связка «бесплатный облачный ассистент для разработки + бесплатная локальная модель внутри продукта» закрыла это задание целиком, от кода до отчёта. Платные тарифы покупают не «ум» — качество ответов у модели среднего тира вроде Sonnet 5 и так высокое, — а объём: больше сообщений в сутки, больше контекста, доступ к самой сильной модели и агентные режимы на весь проект сразу.</w:t>
+        <w:t xml:space="preserve">Итоговая оценка: для учебных, типовых и прототипных задач такого масштаба бесплатного сегмента сегодня достаточно с запасом — связка «бесплатный облачный ассистент для разработки + бесплатная локальная модель внутри продукта» закрыла это задание целиком, от кода до отчёта. Платные тарифы покупают не «ум» — качество ответов у модели среднего тира вроде Sonnet 5 и так высокое, — а объём: больше сообщений в сутки, доступ к самой сильной модели и агентные режимы на весь проект сразу.</w:t>
       </w:r>
     </w:p>
     <w:p>

</xml_diff>